<commit_message>
Intakeformulier: toelichting boxes grow to 3 lines
The open toelichting fields (Q1-6) were only 2 lines tall, too little
room. Naam fields untouched, same 4-page layout.

Co-Authored-By: Claude Sonnet 5 <noreply@anthropic.com>
</commit_message>
<xml_diff>
--- a/documenten/Intakeformulier gespecialiseerde begeleiding - bewerkbare Word-bron.docx
+++ b/documenten/Intakeformulier gespecialiseerde begeleiding - bewerkbare Word-bron.docx
@@ -610,7 +610,7 @@
       </w:tblGrid>
       <w:tr>
         <w:trPr>
-          <w:trHeight w:val="680" w:hRule="atLeast"/>
+          <w:trHeight w:val="1020" w:hRule="atLeast"/>
         </w:trPr>
         <w:tc>
           <w:tcPr>
@@ -868,7 +868,7 @@
       </w:tblGrid>
       <w:tr>
         <w:trPr>
-          <w:trHeight w:val="680" w:hRule="atLeast"/>
+          <w:trHeight w:val="1020" w:hRule="atLeast"/>
         </w:trPr>
         <w:tc>
           <w:tcPr>
@@ -1146,7 +1146,7 @@
       </w:tblGrid>
       <w:tr>
         <w:trPr>
-          <w:trHeight w:val="680" w:hRule="atLeast"/>
+          <w:trHeight w:val="1020" w:hRule="atLeast"/>
         </w:trPr>
         <w:tc>
           <w:tcPr>
@@ -1404,7 +1404,7 @@
       </w:tblGrid>
       <w:tr>
         <w:trPr>
-          <w:trHeight w:val="680" w:hRule="atLeast"/>
+          <w:trHeight w:val="1020" w:hRule="atLeast"/>
         </w:trPr>
         <w:tc>
           <w:tcPr>
@@ -1662,7 +1662,7 @@
       </w:tblGrid>
       <w:tr>
         <w:trPr>
-          <w:trHeight w:val="680" w:hRule="atLeast"/>
+          <w:trHeight w:val="1020" w:hRule="atLeast"/>
         </w:trPr>
         <w:tc>
           <w:tcPr>
@@ -1940,7 +1940,7 @@
       </w:tblGrid>
       <w:tr>
         <w:trPr>
-          <w:trHeight w:val="680" w:hRule="atLeast"/>
+          <w:trHeight w:val="1020" w:hRule="atLeast"/>
         </w:trPr>
         <w:tc>
           <w:tcPr>

</xml_diff>